<commit_message>
Refine school documents section and legal links placement.
Updated the school documents UX, kept only the cash contract option, and moved legal links to a simple footer-style row on the overview page.

Co-authored-by: Cursor <cursoragent@cursor.com>
</commit_message>
<xml_diff>
--- a/static/docs/school/04_Dogovor_5_let.docx
+++ b/static/docs/school/04_Dogovor_5_let.docx
@@ -62,7 +62,7 @@
           <w:color w:val="102A43"/>
           <w:sz w:val="24"/>
         </w:rPr>
-        <w:t>Исполнитель: Пихаев Амур Адланович, физическое лицо, гражданин Российской Федерации, ИНН 201005220670, плательщик налога на профессиональный доход (самозанятый), электронная почта Pikhaev1988@yandex.ru, сайт https://analizgia.ru. Исполнитель не является индивидуальным предпринимателем и не является юридическим лицом.</w:t>
+        <w:t>Исполнитель: Пихаев Амур Адланович, гражданин Российской Федерации, ИНН 201005220670, плательщик налога на профессиональный доход (самозанятый), электронная почта Pikhaev1988@yandex.ru, сайт https://analizgia.ru.</w:t>
       </w:r>
     </w:p>
     <w:p>
@@ -122,7 +122,7 @@
           <w:color w:val="102A43"/>
           <w:sz w:val="24"/>
         </w:rPr>
-        <w:t>1.2. Исключительные права на программу для ЭВМ «Анализ ГИА» принадлежат Исполнителю как физическому лицу — автору и правообладателю и настоящим договором не отчуждаются. Заказчик получает право использования сервиса в объёме доступа к кабинету на срок договора. Заказчик вправе приобретать указанные услуги у физического лица. Создание ООО или ИП на стороне Исполнителя для заключения настоящего договора не требуется.</w:t>
+        <w:t>1.2. Исключительные права на программу для ЭВМ «Анализ ГИА» принадлежат Исполнителю и настоящим договором не отчуждаются. Заказчик получает право использования сервиса в объёме доступа к кабинету на срок договора.</w:t>
       </w:r>
     </w:p>
     <w:p>
@@ -257,7 +257,7 @@
           <w:color w:val="102A43"/>
           <w:sz w:val="24"/>
         </w:rPr>
-        <w:t>3.1. Стоимость услуг за весь 5-летний срок доступа составляет ______________ руб. (____________________________________). НДС не облагается: Исполнитель применяет специальный налоговый режим «Налог на профессиональный доход» как физическое лицо. При передаче Заказчику чека «Мой налог» Заказчик не удерживает НДФЛ с вознаграждения Исполнителя и не начисляет на него страховые взносы.</w:t>
+        <w:t>3.1. Стоимость услуг за весь 5-летний срок доступа составляет ______________ руб. (____________________________________), НДС не облагается в связи с применением Исполнителем специального налогового режима «Налог на профессиональный доход».</w:t>
       </w:r>
     </w:p>
     <w:p>
@@ -272,7 +272,7 @@
           <w:color w:val="102A43"/>
           <w:sz w:val="24"/>
         </w:rPr>
-        <w:t>3.2. Оплата: 100% за весь срок доступа в течение 10 рабочих дней с даты заключения договора, если Стороны письменно не согласовали ежегодный график платежей. При ежегодном графике доступ сохраняется при условии своевременной оплаты очередного периода. Допускается безналичный перевод или наличная оплата.</w:t>
+        <w:t>3.2. Оплата: 100% за весь срок доступа в течение 10 рабочих дней с даты заключения договора, если Стороны письменно не согласовали ежегодный график платежей. При ежегодном графике доступ сохраняется при условии своевременной оплаты очередного периода.</w:t>
       </w:r>
     </w:p>
     <w:p>
@@ -287,7 +287,7 @@
           <w:color w:val="102A43"/>
           <w:sz w:val="24"/>
         </w:rPr>
-        <w:t>3.3. На каждый платёж, в том числе наличными, Исполнитель в момент расчёта формирует чек в приложении «Мой налог» на ИНН Заказчика (покупатель — юридическое лицо) и передаёт чек Заказчику (на электронную почту, в приложении или на бумаге). Без чека НПД расчёт не считается оформленным.</w:t>
+        <w:t>3.3. Исполнитель направляет чек через сервис «Мой налог» на ИНН Заказчика.</w:t>
       </w:r>
     </w:p>
     <w:p>
@@ -542,7 +542,7 @@
           <w:color w:val="102A43"/>
           <w:sz w:val="24"/>
         </w:rPr>
-        <w:t>Исполнитель: Пихаев Амур Адланович, физическое лицо, самозанятый</w:t>
+        <w:t>Исполнитель: Пихаев Амур Адланович</w:t>
       </w:r>
     </w:p>
     <w:p>
@@ -557,7 +557,7 @@
           <w:color w:val="102A43"/>
           <w:sz w:val="24"/>
         </w:rPr>
-        <w:t>ИНН 201005220670  (не является ИП и юридическим лицом)</w:t>
+        <w:t>ИНН 201005220670</w:t>
       </w:r>
     </w:p>
     <w:p>

</xml_diff>